<commit_message>
Cite Friedman for the revised criteria; renumber and audit all references
The Introduction attributed the revised Friedman criteria to Markey, a
review, while the Methods cited Friedman for the same thing. Friedman is
now cited in both places and moved into the Introduction block.

Moving it exposed a second ordering violation: with Markey's only
remaining citation inside a later range, Friedman is cited first, so
Friedman is 2 and Markey 3. Both the citation markers and the reference
list are updated accordingly.

Every reference audited individually by position of first citation: 31
listed, numbering contiguous, none uncited, none out of order. Audit
output kept as report/reference_audit.txt.

Also fixes a missing space after "eTable 1." in Methods 2.2.

Co-Authored-By: Claude Opus 5 <noreply@anthropic.com>
Claude-Session: https://claude.ai/code/session_0172X8UQDX9VQmAw3MZViyzJ
</commit_message>
<xml_diff>
--- a/report/MANUSCRIPT_corrected.docx
+++ b/report/MANUSCRIPT_corrected.docx
@@ -504,43 +504,43 @@
           <w:sz w:val="24"/>
           <w:szCs w:val="24"/>
         </w:rPr>
-        <w:t xml:space="preserve">Idiopathic intracranial hypertension (IIH) is a disorder characterized by elevated cerebrospinal fluid (CSF) pressure in the absence of an identifiable secondary cause. It occurs predominantly in women of reproductive age with obesity, and its incidence continues to rise in parallel with the global obesity epidemic.1 According to the revised Friedman criteria, IIH is defined by papilledema or abducens nerve palsy, elevated lumbar puncture opening pressure, normal CSF composition, a normal neurologic examination apart from cranial nerve abnormalities, and neuroimaging demonstrating no space-occupying lesion, hydrocephalus, or cerebral venous sinus thrombosis.2 A normal mental status and the absence of focal neurologic deficits are themselves diagnostic requirements. Natural-history studies describe headache, transient visual obscurations, pulsatile tinnitus, visual loss, and diplopia as the characteristic clinical spectrum of IIH, without an established association with seizures or epilepsy either at presentation or during long-term follow-up.1--4</w:t>
-      </w:r>
-    </w:p>
-    <w:p>
-      <w:pPr>
-        <w:spacing w:after="120"/>
-      </w:pPr>
-    </w:p>
-    <w:p>
-      <w:pPr>
-        <w:spacing w:after="0" w:line="480"/>
-      </w:pPr>
-      <w:r>
-        <w:rPr>
-          <w:rFonts w:ascii="Times New Roman" w:cs="Times New Roman" w:eastAsia="Times New Roman" w:hAnsi="Times New Roman"/>
-          <w:sz w:val="24"/>
-          <w:szCs w:val="24"/>
-        </w:rPr>
-        <w:t xml:space="preserve">This distinction has important diagnostic implications as IIH remains a diagnosis of exclusion. Among the most important mimics is cerebral venous thrombosis, which can reproduce the headache, papilledema, and sixth-nerve palsy characteristic of IIH but frequently presents with seizures or focal neurologic deficits due to cortical venous involvement.5,6 Consequently, diagnostic paradigms have long distinguished pressure-mediated disease without seizures from structural venous pathology in which seizures are common. This leads to the view that epilepsy represents evidence against rather than a consequence of IIH.</w:t>
-      </w:r>
-    </w:p>
-    <w:p>
-      <w:pPr>
-        <w:spacing w:after="120"/>
-      </w:pPr>
-    </w:p>
-    <w:p>
-      <w:pPr>
-        <w:spacing w:after="0" w:line="480"/>
-      </w:pPr>
-      <w:r>
-        <w:rPr>
-          <w:rFonts w:ascii="Times New Roman" w:cs="Times New Roman" w:eastAsia="Times New Roman" w:hAnsi="Times New Roman"/>
-          <w:sz w:val="24"/>
-          <w:szCs w:val="24"/>
-        </w:rPr>
-        <w:t xml:space="preserve">However, an indirect mechanistic link between IIH and epilepsy has been proposed. Chronic intracranial hypertension may lead to skull-base remodeling and osseous erosion, resulting in meningoceles and, most notably, temporal lobe encephaloceles through the middle cranial fossa. These structural abnormalities have been described in patients with IIH, spontaneous skull-base CSF leaks, and drug-resistant temporal lobe epilepsy, suggesting that sustained elevations in intracranial pressure could create a substrate for epileptogenesis over time rather than precipitating seizures acutely.7 Whether this anatomic association translates into an increased population-level risk of incident seizures or epilepsy remains unknown. Current prognostic frameworks for IIH therefore remain focused on visual outcomes, headache burden, and disease recurrence, with little consideration of seizure-related outcomes.8,9</w:t>
+        <w:t xml:space="preserve">Idiopathic intracranial hypertension (IIH) is a disorder characterized by elevated cerebrospinal fluid (CSF) pressure in the absence of an identifiable secondary cause. It occurs predominantly in women of reproductive age with obesity, and its incidence continues to rise in parallel with the global obesity epidemic.1 According to the revised Friedman criteria, IIH is defined by papilledema or abducens nerve palsy, elevated lumbar puncture opening pressure, normal CSF composition, a normal neurologic examination apart from cranial nerve abnormalities, and neuroimaging demonstrating no space-occupying lesion, hydrocephalus, or cerebral venous sinus thrombosis.2 A normal mental status and the absence of focal neurologic deficits are themselves diagnostic requirements. Natural-history studies describe headache, transient visual obscurations, pulsatile tinnitus, visual loss, and diplopia as the characteristic clinical spectrum of IIH, without an established association with seizures or epilepsy either at presentation or during long-term follow-up.1,3,4,5</w:t>
+      </w:r>
+    </w:p>
+    <w:p>
+      <w:pPr>
+        <w:spacing w:after="120"/>
+      </w:pPr>
+    </w:p>
+    <w:p>
+      <w:pPr>
+        <w:spacing w:after="0" w:line="480"/>
+      </w:pPr>
+      <w:r>
+        <w:rPr>
+          <w:rFonts w:ascii="Times New Roman" w:cs="Times New Roman" w:eastAsia="Times New Roman" w:hAnsi="Times New Roman"/>
+          <w:sz w:val="24"/>
+          <w:szCs w:val="24"/>
+        </w:rPr>
+        <w:t xml:space="preserve">This distinction has important diagnostic implications as IIH remains a diagnosis of exclusion. Among the most important mimics is cerebral venous thrombosis, which can reproduce the headache, papilledema, and sixth-nerve palsy characteristic of IIH but frequently presents with seizures or focal neurologic deficits due to cortical venous involvement.6,7 Consequently, diagnostic paradigms have long distinguished pressure-mediated disease without seizures from structural venous pathology in which seizures are common. This leads to the view that epilepsy represents evidence against rather than a consequence of IIH.</w:t>
+      </w:r>
+    </w:p>
+    <w:p>
+      <w:pPr>
+        <w:spacing w:after="120"/>
+      </w:pPr>
+    </w:p>
+    <w:p>
+      <w:pPr>
+        <w:spacing w:after="0" w:line="480"/>
+      </w:pPr>
+      <w:r>
+        <w:rPr>
+          <w:rFonts w:ascii="Times New Roman" w:cs="Times New Roman" w:eastAsia="Times New Roman" w:hAnsi="Times New Roman"/>
+          <w:sz w:val="24"/>
+          <w:szCs w:val="24"/>
+        </w:rPr>
+        <w:t xml:space="preserve">However, an indirect mechanistic link between IIH and epilepsy has been proposed. Chronic intracranial hypertension may lead to skull-base remodeling and osseous erosion, resulting in meningoceles and, most notably, temporal lobe encephaloceles through the middle cranial fossa. These structural abnormalities have been described in patients with IIH, spontaneous skull-base CSF leaks, and drug-resistant temporal lobe epilepsy, suggesting that sustained elevations in intracranial pressure could create a substrate for epileptogenesis over time rather than precipitating seizures acutely.8 Whether this anatomic association translates into an increased population-level risk of incident seizures or epilepsy remains unknown. Current prognostic frameworks for IIH therefore remain focused on visual outcomes, headache burden, and disease recurrence, with little consideration of seizure-related outcomes.9,10</w:t>
       </w:r>
     </w:p>
     <w:p>
@@ -626,7 +626,7 @@
           <w:sz w:val="24"/>
           <w:szCs w:val="24"/>
         </w:rPr>
-        <w:t xml:space="preserve">This report follows the STROBE and RECORD reporting guidelines.10,11 The study was approved by the Mayo Clinic Institutional Review Board, which waived the requirement for informed consent.</w:t>
+        <w:t xml:space="preserve">This report follows the STROBE and RECORD reporting guidelines.11,12 The study was approved by the Mayo Clinic Institutional Review Board, which waived the requirement for informed consent.</w:t>
       </w:r>
     </w:p>
     <w:p>
@@ -660,7 +660,7 @@
           <w:sz w:val="24"/>
           <w:szCs w:val="24"/>
         </w:rPr>
-        <w:t xml:space="preserve">Patients with IIH. Adolescents and adults were identified using an IIH diagnosis code (ICD-9-CM 348.2 or ICD-10-CM G93.2, in any position) together with a lumbar puncture record (CPT 62270 or 62328, or an electronic lumbar puncture procedure entry). The index date was the date of the diagnostic lumbar puncture. IIH diagnoses were not adjudicated against the revised diagnostic criteria; opening pressure was abstracted when available.12 The complete code list is provided in eTable 1.Comparators were patients with no IIH diagnosis code at any time in the available record.</w:t>
+        <w:t xml:space="preserve">Patients with IIH. Adolescents and adults were identified using an IIH diagnosis code (ICD-9-CM 348.2 or ICD-10-CM G93.2, in any position) together with a lumbar puncture record (CPT 62270 or 62328, or an electronic lumbar puncture procedure entry). The index date was the date of the diagnostic lumbar puncture. IIH diagnoses were not adjudicated against the revised diagnostic criteria; opening pressure was abstracted when available.2 The complete code list is provided in eTable 1. Comparators were patients with no IIH diagnosis code at any time in the available record.</w:t>
       </w:r>
     </w:p>
     <w:p>
@@ -2063,24 +2063,6 @@
     </w:p>
     <w:p>
       <w:pPr>
-        <w:spacing w:after="0" w:line="480"/>
-      </w:pPr>
-      <w:r>
-        <w:rPr>
-          <w:rFonts w:ascii="Times New Roman" w:cs="Times New Roman" w:eastAsia="Times New Roman" w:hAnsi="Times New Roman"/>
-          <w:sz w:val="24"/>
-          <w:szCs w:val="24"/>
-        </w:rPr>
-        <w:t xml:space="preserve">2. Markey KA, Mollan SP, Jensen RH, Sinclair AJ. Understanding idiopathic intracranial hypertension: mechanisms, management, and future directions. Lancet Neurol. 2016;15(1):78-91. doi:10.1016/S1474-4422(15)00298-7</w:t>
-      </w:r>
-    </w:p>
-    <w:p>
-      <w:pPr>
-        <w:spacing w:after="120"/>
-      </w:pPr>
-    </w:p>
-    <w:p>
-      <w:pPr>
         <w:spacing w:after="40" w:line="300"/>
       </w:pPr>
       <w:r>
@@ -2089,38 +2071,20 @@
           <w:sz w:val="24"/>
           <w:szCs w:val="24"/>
         </w:rPr>
-        <w:t xml:space="preserve">3. Patel P, Ross A, Henretig FM, et al. Clinical reasoning: a 12-year-old girl with headache and change in mental status. Neurology. 2018;90(11):e1000-e1004.</w:t>
-      </w:r>
-    </w:p>
-    <w:p>
-      <w:pPr>
-        <w:spacing w:after="0" w:line="480"/>
-      </w:pPr>
-      <w:r>
-        <w:rPr>
-          <w:rFonts w:ascii="Times New Roman" w:cs="Times New Roman" w:eastAsia="Times New Roman" w:hAnsi="Times New Roman"/>
-          <w:sz w:val="24"/>
-          <w:szCs w:val="24"/>
-        </w:rPr>
-        <w:t xml:space="preserve">4. Olaru C, Langberg S, McCoin NS. A review of the clinical presentation, causes, and diagnostic evaluation of increased intracranial pressure in the emergency department. West J Emerg Med. 2024;25(6):1046-1057.</w:t>
-      </w:r>
-    </w:p>
-    <w:p>
-      <w:pPr>
-        <w:spacing w:after="120"/>
-      </w:pPr>
-    </w:p>
-    <w:p>
-      <w:pPr>
-        <w:spacing w:after="0" w:line="480"/>
-      </w:pPr>
-      <w:r>
-        <w:rPr>
-          <w:rFonts w:ascii="Times New Roman" w:cs="Times New Roman" w:eastAsia="Times New Roman" w:hAnsi="Times New Roman"/>
-          <w:sz w:val="24"/>
-          <w:szCs w:val="24"/>
-        </w:rPr>
-        <w:t xml:space="preserve">5. Saposnik G, Bushnell C, Coutinho JM, et al. Diagnosis and management of cerebral venous thrombosis: a scientific statement from the American Heart Association. Stroke. 2024;55(12):e77-e90. doi:10.1161/STR.0000000000000456</w:t>
+        <w:t xml:space="preserve">2. Friedman DI, Liu GT, Digre KB. Revised diagnostic criteria for the pseudotumor cerebri syndrome in adults and children. Neurology. 2013;81(13):1159--1165.</w:t>
+      </w:r>
+    </w:p>
+    <w:p>
+      <w:pPr>
+        <w:spacing w:after="0" w:line="480"/>
+      </w:pPr>
+      <w:r>
+        <w:rPr>
+          <w:rFonts w:ascii="Times New Roman" w:cs="Times New Roman" w:eastAsia="Times New Roman" w:hAnsi="Times New Roman"/>
+          <w:sz w:val="24"/>
+          <w:szCs w:val="24"/>
+        </w:rPr>
+        <w:t xml:space="preserve">3. Markey KA, Mollan SP, Jensen RH, Sinclair AJ. Understanding idiopathic intracranial hypertension: mechanisms, management, and future directions. Lancet Neurol. 2016;15(1):78-91. doi:10.1016/S1474-4422(15)00298-7</w:t>
       </w:r>
     </w:p>
     <w:p>
@@ -2138,8 +2102,44 @@
           <w:sz w:val="24"/>
           <w:szCs w:val="24"/>
         </w:rPr>
-        <w:t xml:space="preserve">6. Ropper AH, Klein JP. Cerebral venous thrombosis. N Engl J Med. 2021;385(1):59-64. doi:10.1056/NEJMra2106545</w:t>
-      </w:r>
+        <w:t xml:space="preserve">4. Patel P, Ross A, Henretig FM, et al. Clinical reasoning: a 12-year-old girl with headache and change in mental status. Neurology. 2018;90(11):e1000-e1004.</w:t>
+      </w:r>
+    </w:p>
+    <w:p>
+      <w:pPr>
+        <w:spacing w:after="0" w:line="480"/>
+      </w:pPr>
+      <w:r>
+        <w:rPr>
+          <w:rFonts w:ascii="Times New Roman" w:cs="Times New Roman" w:eastAsia="Times New Roman" w:hAnsi="Times New Roman"/>
+          <w:sz w:val="24"/>
+          <w:szCs w:val="24"/>
+        </w:rPr>
+        <w:t xml:space="preserve">5. Olaru C, Langberg S, McCoin NS. A review of the clinical presentation, causes, and diagnostic evaluation of increased intracranial pressure in the emergency department. West J Emerg Med. 2024;25(6):1046-1057.</w:t>
+      </w:r>
+    </w:p>
+    <w:p>
+      <w:pPr>
+        <w:spacing w:after="120"/>
+      </w:pPr>
+    </w:p>
+    <w:p>
+      <w:pPr>
+        <w:spacing w:after="0" w:line="480"/>
+      </w:pPr>
+      <w:r>
+        <w:rPr>
+          <w:rFonts w:ascii="Times New Roman" w:cs="Times New Roman" w:eastAsia="Times New Roman" w:hAnsi="Times New Roman"/>
+          <w:sz w:val="24"/>
+          <w:szCs w:val="24"/>
+        </w:rPr>
+        <w:t xml:space="preserve">6. Saposnik G, Bushnell C, Coutinho JM, et al. Diagnosis and management of cerebral venous thrombosis: a scientific statement from the American Heart Association. Stroke. 2024;55(12):e77-e90. doi:10.1161/STR.0000000000000456</w:t>
+      </w:r>
+    </w:p>
+    <w:p>
+      <w:pPr>
+        <w:spacing w:after="120"/>
+      </w:pPr>
     </w:p>
     <w:p>
       <w:pPr>
@@ -2151,26 +2151,8 @@
           <w:sz w:val="24"/>
           <w:szCs w:val="24"/>
         </w:rPr>
-        <w:t xml:space="preserve">7. Chen BS, Britton JOT. Expanding the clinical spectrum of idiopathic intracranial hypertension. Curr Opin Neurol. 2023;36(1):80-86.</w:t>
-      </w:r>
-    </w:p>
-    <w:p>
-      <w:pPr>
-        <w:spacing w:after="0" w:line="480"/>
-      </w:pPr>
-      <w:r>
-        <w:rPr>
-          <w:rFonts w:ascii="Times New Roman" w:cs="Times New Roman" w:eastAsia="Times New Roman" w:hAnsi="Times New Roman"/>
-          <w:sz w:val="24"/>
-          <w:szCs w:val="24"/>
-        </w:rPr>
-        <w:t xml:space="preserve">8. Toscano S, Lo Fermo S, Reggio E, et al. An update on idiopathic intracranial hypertension in adults: a look at pathophysiology, diagnostic approach and management. J Neurol. 2021;268(9):3249-3268. doi:10.1007/s00415-020-09943-9</w:t>
-      </w:r>
-    </w:p>
-    <w:p>
-      <w:pPr>
-        <w:spacing w:after="120"/>
-      </w:pPr>
+        <w:t xml:space="preserve">7. Ropper AH, Klein JP. Cerebral venous thrombosis. N Engl J Med. 2021;385(1):59-64. doi:10.1056/NEJMra2106545</w:t>
+      </w:r>
     </w:p>
     <w:p>
       <w:pPr>
@@ -2182,20 +2164,20 @@
           <w:sz w:val="24"/>
           <w:szCs w:val="24"/>
         </w:rPr>
-        <w:t xml:space="preserve">9. Molander LD, Hagen SM, Hansen NS, et al. Patterns of retinal damage and visual long-term consequences in patients with idiopathic intracranial hypertension. Neurology. 2025;104(7):e211234.</w:t>
-      </w:r>
-    </w:p>
-    <w:p>
-      <w:pPr>
-        <w:spacing w:after="0" w:line="480"/>
-      </w:pPr>
-      <w:r>
-        <w:rPr>
-          <w:rFonts w:ascii="Times New Roman" w:cs="Times New Roman" w:eastAsia="Times New Roman" w:hAnsi="Times New Roman"/>
-          <w:sz w:val="24"/>
-          <w:szCs w:val="24"/>
-        </w:rPr>
-        <w:t xml:space="preserve">10. von Elm E, Altman DG, Egger M, et al. The Strengthening the Reporting of Observational Studies in Epidemiology (STROBE) statement: guidelines for reporting observational studies. Lancet. 2007;370(9596):1453--1457.</w:t>
+        <w:t xml:space="preserve">8. Chen BS, Britton JOT. Expanding the clinical spectrum of idiopathic intracranial hypertension. Curr Opin Neurol. 2023;36(1):80-86.</w:t>
+      </w:r>
+    </w:p>
+    <w:p>
+      <w:pPr>
+        <w:spacing w:after="0" w:line="480"/>
+      </w:pPr>
+      <w:r>
+        <w:rPr>
+          <w:rFonts w:ascii="Times New Roman" w:cs="Times New Roman" w:eastAsia="Times New Roman" w:hAnsi="Times New Roman"/>
+          <w:sz w:val="24"/>
+          <w:szCs w:val="24"/>
+        </w:rPr>
+        <w:t xml:space="preserve">9. Toscano S, Lo Fermo S, Reggio E, et al. An update on idiopathic intracranial hypertension in adults: a look at pathophysiology, diagnostic approach and management. J Neurol. 2021;268(9):3249-3268. doi:10.1007/s00415-020-09943-9</w:t>
       </w:r>
     </w:p>
     <w:p>
@@ -2213,8 +2195,26 @@
           <w:sz w:val="24"/>
           <w:szCs w:val="24"/>
         </w:rPr>
-        <w:t xml:space="preserve">11. Benchimol EI, Smeeth L, Guttmann A, et al. The REporting of studies Conducted using Observational Routinely-collected health Data (RECORD) statement. PLoS Med. 2015;12(10):e1001885.</w:t>
-      </w:r>
+        <w:t xml:space="preserve">10. Molander LD, Hagen SM, Hansen NS, et al. Patterns of retinal damage and visual long-term consequences in patients with idiopathic intracranial hypertension. Neurology. 2025;104(7):e211234.</w:t>
+      </w:r>
+    </w:p>
+    <w:p>
+      <w:pPr>
+        <w:spacing w:after="0" w:line="480"/>
+      </w:pPr>
+      <w:r>
+        <w:rPr>
+          <w:rFonts w:ascii="Times New Roman" w:cs="Times New Roman" w:eastAsia="Times New Roman" w:hAnsi="Times New Roman"/>
+          <w:sz w:val="24"/>
+          <w:szCs w:val="24"/>
+        </w:rPr>
+        <w:t xml:space="preserve">11. von Elm E, Altman DG, Egger M, et al. The Strengthening the Reporting of Observational Studies in Epidemiology (STROBE) statement: guidelines for reporting observational studies. Lancet. 2007;370(9596):1453--1457.</w:t>
+      </w:r>
+    </w:p>
+    <w:p>
+      <w:pPr>
+        <w:spacing w:after="120"/>
+      </w:pPr>
     </w:p>
     <w:p>
       <w:pPr>
@@ -2226,7 +2226,7 @@
           <w:sz w:val="24"/>
           <w:szCs w:val="24"/>
         </w:rPr>
-        <w:t xml:space="preserve">12. Friedman DI, Liu GT, Digre KB. Revised diagnostic criteria for the pseudotumor cerebri syndrome in adults and children. Neurology. 2013;81(13):1159--1165.</w:t>
+        <w:t xml:space="preserve">12. Benchimol EI, Smeeth L, Guttmann A, et al. The REporting of studies Conducted using Observational Routinely-collected health Data (RECORD) statement. PLoS Med. 2015;12(10):e1001885.</w:t>
       </w:r>
     </w:p>
     <w:p>

</xml_diff>